<commit_message>
Deploying to gh-pages from @ Morrison-Lab/psc@f0941ee744a99074dfe6c01138b2285774c6fead 🚀
</commit_message>
<xml_diff>
--- a/chapters/github.docx
+++ b/chapters/github.docx
@@ -15,7 +15,7 @@
         <w:pStyle w:val="Date"/>
       </w:pPr>
       <w:r>
-        <w:t xml:space="preserve">Last modified: 2026-10-12 20:18:39 (PDT)</w:t>
+        <w:t xml:space="preserve">Last modified: 2026-10-12 21:28:22 (PDT)</w:t>
       </w:r>
     </w:p>
     <w:p>
@@ -3748,7 +3748,22 @@
         <w:t xml:space="preserve"> </w:t>
       </w:r>
       <w:r>
-        <w:t xml:space="preserve">in Happy Git with R.</w:t>
+        <w:t xml:space="preserve">of Happy Git and GitHub for the useR</w:t>
+      </w:r>
+      <w:r>
+        <w:t xml:space="preserve"> </w:t>
+      </w:r>
+      <w:r>
+        <w:t xml:space="preserve">(Bryan 2023, ch. </w:t>
+      </w:r>
+      <w:r>
+        <w:t xml:space="preserve">“Repeated amend”</w:t>
+      </w:r>
+      <w:r>
+        <w:t xml:space="preserve">)</w:t>
+      </w:r>
+      <w:r>
+        <w:t xml:space="preserve">.</w:t>
       </w:r>
     </w:p>
     <w:bookmarkEnd w:id="51"/>
@@ -7445,7 +7460,7 @@
     </w:p>
     <w:bookmarkEnd w:id="80"/>
     <w:bookmarkEnd w:id="81"/>
-    <w:bookmarkStart w:id="98" w:name="sec-removing-sensitive-data"/>
+    <w:bookmarkStart w:id="100" w:name="sec-removing-sensitive-data"/>
     <w:p>
       <w:pPr>
         <w:pStyle w:val="Heading2"/>
@@ -7494,7 +7509,7 @@
         <w:t xml:space="preserve">as the data remains accessible in earlier commit snapshots.</w:t>
       </w:r>
     </w:p>
-    <w:bookmarkStart w:id="97" w:name="immediate-steps"/>
+    <w:bookmarkStart w:id="99" w:name="immediate-steps"/>
     <w:p>
       <w:pPr>
         <w:pStyle w:val="Heading3"/>
@@ -7750,8 +7765,45 @@
         <w:t xml:space="preserve">.</w:t>
       </w:r>
     </w:p>
-    <w:bookmarkStart w:id="96" w:name="refs"/>
-    <w:bookmarkStart w:id="85" w:name="ref-githubdesktop"/>
+    <w:bookmarkStart w:id="98" w:name="refs"/>
+    <w:bookmarkStart w:id="86" w:name="ref-bryan2023happygit"/>
+    <w:p>
+      <w:pPr>
+        <w:pStyle w:val="Bibliography"/>
+      </w:pPr>
+      <w:r>
+        <w:t xml:space="preserve">Bryan, Jennifer. 2023.</w:t>
+      </w:r>
+      <w:r>
+        <w:t xml:space="preserve"> </w:t>
+      </w:r>
+      <w:r>
+        <w:rPr>
+          <w:i/>
+          <w:iCs/>
+        </w:rPr>
+        <w:t xml:space="preserve">Happy Git and GitHub for the useR</w:t>
+      </w:r>
+      <w:r>
+        <w:t xml:space="preserve">.</w:t>
+      </w:r>
+      <w:r>
+        <w:t xml:space="preserve"> </w:t>
+      </w:r>
+      <w:hyperlink r:id="rId85">
+        <w:r>
+          <w:rPr>
+            <w:rStyle w:val="Hyperlink"/>
+          </w:rPr>
+          <w:t xml:space="preserve">https://happygitwithr.com/</w:t>
+        </w:r>
+      </w:hyperlink>
+      <w:r>
+        <w:t xml:space="preserve">.</w:t>
+      </w:r>
+    </w:p>
+    <w:bookmarkEnd w:id="86"/>
+    <w:bookmarkStart w:id="87" w:name="ref-githubdesktop"/>
     <w:p>
       <w:pPr>
         <w:pStyle w:val="Bibliography"/>
@@ -7780,8 +7832,8 @@
         <w:t xml:space="preserve">.</w:t>
       </w:r>
     </w:p>
-    <w:bookmarkEnd w:id="85"/>
-    <w:bookmarkStart w:id="86" w:name="ref-gitkraken"/>
+    <w:bookmarkEnd w:id="87"/>
+    <w:bookmarkStart w:id="88" w:name="ref-gitkraken"/>
     <w:p>
       <w:pPr>
         <w:pStyle w:val="Bibliography"/>
@@ -7810,8 +7862,8 @@
         <w:t xml:space="preserve">.</w:t>
       </w:r>
     </w:p>
-    <w:bookmarkEnd w:id="86"/>
-    <w:bookmarkStart w:id="87" w:name="ref-gitkraken-kepler"/>
+    <w:bookmarkEnd w:id="88"/>
+    <w:bookmarkStart w:id="89" w:name="ref-gitkraken-kepler"/>
     <w:p>
       <w:pPr>
         <w:pStyle w:val="Bibliography"/>
@@ -7840,8 +7892,8 @@
         <w:t xml:space="preserve">.</w:t>
       </w:r>
     </w:p>
-    <w:bookmarkEnd w:id="87"/>
-    <w:bookmarkStart w:id="89" w:name="ref-githubaccountarchive"/>
+    <w:bookmarkEnd w:id="89"/>
+    <w:bookmarkStart w:id="91" w:name="ref-githubaccountarchive"/>
     <w:p>
       <w:pPr>
         <w:pStyle w:val="Bibliography"/>
@@ -7858,7 +7910,7 @@
       <w:r>
         <w:t xml:space="preserve"> </w:t>
       </w:r>
-      <w:hyperlink r:id="rId88">
+      <w:hyperlink r:id="rId90">
         <w:r>
           <w:rPr>
             <w:rStyle w:val="Hyperlink"/>
@@ -7870,8 +7922,8 @@
         <w:t xml:space="preserve">.</w:t>
       </w:r>
     </w:p>
-    <w:bookmarkEnd w:id="89"/>
-    <w:bookmarkStart w:id="91" w:name="ref-githuborgmigrations"/>
+    <w:bookmarkEnd w:id="91"/>
+    <w:bookmarkStart w:id="93" w:name="ref-githuborgmigrations"/>
     <w:p>
       <w:pPr>
         <w:pStyle w:val="Bibliography"/>
@@ -7888,7 +7940,7 @@
       <w:r>
         <w:t xml:space="preserve"> </w:t>
       </w:r>
-      <w:hyperlink r:id="rId90">
+      <w:hyperlink r:id="rId92">
         <w:r>
           <w:rPr>
             <w:rStyle w:val="Hyperlink"/>
@@ -7900,8 +7952,8 @@
         <w:t xml:space="preserve">.</w:t>
       </w:r>
     </w:p>
-    <w:bookmarkEnd w:id="91"/>
-    <w:bookmarkStart w:id="93" w:name="ref-githubusermigrations"/>
+    <w:bookmarkEnd w:id="93"/>
+    <w:bookmarkStart w:id="95" w:name="ref-githubusermigrations"/>
     <w:p>
       <w:pPr>
         <w:pStyle w:val="Bibliography"/>
@@ -7918,7 +7970,7 @@
       <w:r>
         <w:t xml:space="preserve"> </w:t>
       </w:r>
-      <w:hyperlink r:id="rId92">
+      <w:hyperlink r:id="rId94">
         <w:r>
           <w:rPr>
             <w:rStyle w:val="Hyperlink"/>
@@ -7930,8 +7982,8 @@
         <w:t xml:space="preserve">.</w:t>
       </w:r>
     </w:p>
-    <w:bookmarkEnd w:id="93"/>
-    <w:bookmarkStart w:id="95" w:name="ref-gitfixum"/>
+    <w:bookmarkEnd w:id="95"/>
+    <w:bookmarkStart w:id="97" w:name="ref-gitfixum"/>
     <w:p>
       <w:pPr>
         <w:pStyle w:val="Bibliography"/>
@@ -7948,7 +8000,7 @@
       <w:r>
         <w:t xml:space="preserve"> </w:t>
       </w:r>
-      <w:hyperlink r:id="rId94">
+      <w:hyperlink r:id="rId96">
         <w:r>
           <w:rPr>
             <w:rStyle w:val="Hyperlink"/>
@@ -7960,10 +8012,10 @@
         <w:t xml:space="preserve">.</w:t>
       </w:r>
     </w:p>
-    <w:bookmarkEnd w:id="95"/>
-    <w:bookmarkEnd w:id="96"/>
     <w:bookmarkEnd w:id="97"/>
     <w:bookmarkEnd w:id="98"/>
+    <w:bookmarkEnd w:id="99"/>
+    <w:bookmarkEnd w:id="100"/>
     <w:sectPr>
       <w:footnotePr>
         <w:numRestart w:val="eachSect"/>

</xml_diff>